<commit_message>
Day16-ManualReActLoop: fix silently-dropped tool calls, add project.md
The loop checked for empty result.Content and skipped the turn before
extracting FunctionCallContent items, but Gemini often returns empty
Content on tool-call-only turns - so a genuine tool request would be
silently ignored every iteration until the loop just stalled out at
the iteration cap. Reorders the check and preserves the full response
(text + tool calls) in history via history.Add(result). Syncs the
docx's Complete Code listing and replaces missing.md with project.md.
</commit_message>
<xml_diff>
--- a/Day16-ManualReActLoop.docx
+++ b/Day16-ManualReActLoop.docx
@@ -1307,106 +1307,182 @@
           <w:rFonts w:ascii="Consolas" w:hAnsi="Consolas"/>
           <w:sz w:val="19"/>
         </w:rPr>
-        <w:t xml:space="preserve">                if (string.IsNullOrEmpty(result.Content)) continue;</w:t>
-      </w:r>
-    </w:p>
-    <w:p>
-      <w:pPr>
-        <w:pStyle w:val="NoSpacing"/>
-        <w:rPr>
-          <w:rFonts w:ascii="Consolas" w:hAnsi="Consolas"/>
-          <w:sz w:val="19"/>
-        </w:rPr>
-      </w:pPr>
-    </w:p>
-    <w:p>
-      <w:pPr>
-        <w:pStyle w:val="NoSpacing"/>
-        <w:rPr>
-          <w:rFonts w:ascii="Consolas" w:hAnsi="Consolas"/>
-          <w:sz w:val="19"/>
-        </w:rPr>
-      </w:pPr>
-      <w:r>
-        <w:rPr>
-          <w:rFonts w:ascii="Consolas" w:hAnsi="Consolas"/>
-          <w:sz w:val="19"/>
-        </w:rPr>
-        <w:t xml:space="preserve">                // Print the AI's THOUGHT and ACTION</w:t>
-      </w:r>
-    </w:p>
-    <w:p>
-      <w:pPr>
-        <w:pStyle w:val="NoSpacing"/>
-        <w:rPr>
-          <w:rFonts w:ascii="Consolas" w:hAnsi="Consolas"/>
-          <w:sz w:val="19"/>
-        </w:rPr>
-      </w:pPr>
-      <w:r>
-        <w:rPr>
-          <w:rFonts w:ascii="Consolas" w:hAnsi="Consolas"/>
-          <w:sz w:val="19"/>
-        </w:rPr>
-        <w:t xml:space="preserve">                Console.WriteLine(result.Content);</w:t>
-      </w:r>
-    </w:p>
-    <w:p>
-      <w:pPr>
-        <w:pStyle w:val="NoSpacing"/>
-        <w:rPr>
-          <w:rFonts w:ascii="Consolas" w:hAnsi="Consolas"/>
-          <w:sz w:val="19"/>
-        </w:rPr>
-      </w:pPr>
-      <w:r>
-        <w:rPr>
-          <w:rFonts w:ascii="Consolas" w:hAnsi="Consolas"/>
-          <w:sz w:val="19"/>
-        </w:rPr>
-        <w:t xml:space="preserve">                history.AddAssistantMessage(result.Content);</w:t>
-      </w:r>
-    </w:p>
-    <w:p>
-      <w:pPr>
-        <w:pStyle w:val="NoSpacing"/>
-        <w:rPr>
-          <w:rFonts w:ascii="Consolas" w:hAnsi="Consolas"/>
-          <w:sz w:val="19"/>
-        </w:rPr>
-      </w:pPr>
-    </w:p>
-    <w:p>
-      <w:pPr>
-        <w:pStyle w:val="NoSpacing"/>
-        <w:rPr>
-          <w:rFonts w:ascii="Consolas" w:hAnsi="Consolas"/>
-          <w:sz w:val="19"/>
-        </w:rPr>
-      </w:pPr>
-      <w:r>
-        <w:rPr>
-          <w:rFonts w:ascii="Consolas" w:hAnsi="Consolas"/>
-          <w:sz w:val="19"/>
-        </w:rPr>
-        <w:t xml:space="preserve">                // 3. Check if the AI wants to call a tool</w:t>
-      </w:r>
-    </w:p>
-    <w:p>
-      <w:pPr>
-        <w:pStyle w:val="NoSpacing"/>
-        <w:rPr>
-          <w:rFonts w:ascii="Consolas" w:hAnsi="Consolas"/>
-          <w:sz w:val="19"/>
-        </w:rPr>
-      </w:pPr>
-      <w:r>
-        <w:rPr>
-          <w:rFonts w:ascii="Consolas" w:hAnsi="Consolas"/>
-          <w:sz w:val="19"/>
-        </w:rPr>
-        <w:t xml:space="preserve">                var toolCalls = result.Items.OfType&lt;FunctionCallContent&gt;().ToList();</w:t>
-      </w:r>
+        <w:t xml:space="preserve">                </w:t>
+      </w:r>
+      <w:r>
+        <w:rPr>
+          <w:rFonts w:ascii="Consolas" w:hAnsi="Consolas"/>
+          <w:sz w:val="19"/>
+        </w:rPr>
+        <w:t xml:space="preserve">                // 3. Check for a tool-call request BEFORE looking at Content. Gemini</w:t>
+      </w:r>
+    </w:p>
+    <w:p>
+      <w:pPr>
+        <w:pStyle w:val="NoSpacing"/>
+        <w:rPr>
+          <w:rFonts w:ascii="Consolas" w:hAnsi="Consolas"/>
+          <w:sz w:val="19"/>
+        </w:rPr>
+      </w:pPr>
+      <w:r>
+        <w:rPr>
+          <w:rFonts w:ascii="Consolas" w:hAnsi="Consolas"/>
+          <w:sz w:val="19"/>
+        </w:rPr>
+        <w:t xml:space="preserve">                // often returns an empty Content string when it is requesting a</w:t>
+      </w:r>
+    </w:p>
+    <w:p>
+      <w:pPr>
+        <w:pStyle w:val="NoSpacing"/>
+        <w:rPr>
+          <w:rFonts w:ascii="Consolas" w:hAnsi="Consolas"/>
+          <w:sz w:val="19"/>
+        </w:rPr>
+      </w:pPr>
+      <w:r>
+        <w:rPr>
+          <w:rFonts w:ascii="Consolas" w:hAnsi="Consolas"/>
+          <w:sz w:val="19"/>
+        </w:rPr>
+        <w:t xml:space="preserve">                // function call instead of talking</w:t>
+      </w:r>
+      <w:r>
+        <w:rPr>
+          <w:rFonts w:ascii="Consolas" w:hAnsi="Consolas"/>
+          <w:sz w:val="19"/>
+        </w:rPr>
+        <w:t xml:space="preserve"> - checking Content first (and</w:t>
+      </w:r>
+    </w:p>
+    <w:p>
+      <w:pPr>
+        <w:pStyle w:val="NoSpacing"/>
+        <w:rPr>
+          <w:rFonts w:ascii="Consolas" w:hAnsi="Consolas"/>
+          <w:sz w:val="19"/>
+        </w:rPr>
+      </w:pPr>
+      <w:r>
+        <w:rPr>
+          <w:rFonts w:ascii="Consolas" w:hAnsi="Consolas"/>
+          <w:sz w:val="19"/>
+        </w:rPr>
+        <w:t xml:space="preserve">                // skipping the turn when it's empty) would silently ignore that</w:t>
+      </w:r>
+    </w:p>
+    <w:p>
+      <w:pPr>
+        <w:pStyle w:val="NoSpacing"/>
+        <w:rPr>
+          <w:rFonts w:ascii="Consolas" w:hAnsi="Consolas"/>
+          <w:sz w:val="19"/>
+        </w:rPr>
+      </w:pPr>
+      <w:r>
+        <w:rPr>
+          <w:rFonts w:ascii="Consolas" w:hAnsi="Consolas"/>
+          <w:sz w:val="19"/>
+        </w:rPr>
+        <w:t xml:space="preserve">                // function call forever and stall the loop until the iteration cap.</w:t>
+      </w:r>
+    </w:p>
+    <w:p>
+      <w:pPr>
+        <w:pStyle w:val="NoSpacing"/>
+        <w:rPr>
+          <w:rFonts w:ascii="Consolas" w:hAnsi="Consolas"/>
+          <w:sz w:val="19"/>
+        </w:rPr>
+      </w:pPr>
+      <w:r>
+        <w:rPr>
+          <w:rFonts w:ascii="Consolas" w:hAnsi="Consolas"/>
+          <w:sz w:val="19"/>
+        </w:rPr>
+        <w:t xml:space="preserve">                var t</w:t>
+      </w:r>
+      <w:r>
+        <w:rPr>
+          <w:rFonts w:ascii="Consolas" w:hAnsi="Consolas"/>
+          <w:sz w:val="19"/>
+        </w:rPr>
+        <w:t>oolCalls = result.Items.OfType&lt;FunctionCallContent&gt;().ToList();</w:t>
+      </w:r>
+    </w:p>
+    <w:p>
+      <w:pPr>
+        <w:pStyle w:val="NoSpacing"/>
+        <w:rPr>
+          <w:rFonts w:ascii="Consolas" w:hAnsi="Consolas"/>
+          <w:sz w:val="19"/>
+        </w:rPr>
+      </w:pPr>
+    </w:p>
+    <w:p>
+      <w:pPr>
+        <w:pStyle w:val="NoSpacing"/>
+        <w:rPr>
+          <w:rFonts w:ascii="Consolas" w:hAnsi="Consolas"/>
+          <w:sz w:val="19"/>
+        </w:rPr>
+      </w:pPr>
+      <w:r>
+        <w:rPr>
+          <w:rFonts w:ascii="Consolas" w:hAnsi="Consolas"/>
+          <w:sz w:val="19"/>
+        </w:rPr>
+        <w:t xml:space="preserve">                // Print the AI's THOUGHT and ACTION text, if any was produced this turn.</w:t>
+      </w:r>
+    </w:p>
+    <w:p>
+      <w:pPr>
+        <w:pStyle w:val="NoSpacing"/>
+        <w:rPr>
+          <w:rFonts w:ascii="Consolas" w:hAnsi="Consolas"/>
+          <w:sz w:val="19"/>
+        </w:rPr>
+      </w:pPr>
+      <w:r>
+        <w:rPr>
+          <w:rFonts w:ascii="Consolas" w:hAnsi="Consolas"/>
+          <w:sz w:val="19"/>
+        </w:rPr>
+        <w:t xml:space="preserve">                if (!string.IsNullOrEmpty(result.Content)) Cons</w:t>
+      </w:r>
+      <w:r>
+        <w:rPr>
+          <w:rFonts w:ascii="Consolas" w:hAnsi="Consolas"/>
+          <w:sz w:val="19"/>
+        </w:rPr>
+        <w:t>ole.WriteLine(result.Content);</w:t>
+      </w:r>
+    </w:p>
+    <w:p>
+      <w:pPr>
+        <w:pStyle w:val="NoSpacing"/>
+        <w:rPr>
+          <w:rFonts w:ascii="Consolas" w:hAnsi="Consolas"/>
+          <w:sz w:val="19"/>
+        </w:rPr>
+      </w:pPr>
+      <w:r>
+        <w:rPr>
+          <w:rFonts w:ascii="Consolas" w:hAnsi="Consolas"/>
+          <w:sz w:val="19"/>
+        </w:rPr>
+        <w:t xml:space="preserve">                history.Add(result); // Keep the full response (text + FunctionCallContent) in history.</w:t>
+      </w:r>
+    </w:p>
+    <w:p>
+      <w:pPr>
+        <w:pStyle w:val="NoSpacing"/>
+        <w:rPr>
+          <w:rFonts w:ascii="Consolas" w:hAnsi="Consolas"/>
+          <w:sz w:val="19"/>
+        </w:rPr>
+      </w:pPr>
     </w:p>
     <w:p>
       <w:pPr>
@@ -1688,7 +1764,11 @@
         <w:t>Step 2: A System Prompt That Demands a Specific Format.</w:t>
       </w:r>
       <w:r>
-        <w:t xml:space="preserve"> The `ChatHistory` is seeded with a system message instructing the model to always respond with a `THOUGHT` (its reasoning) followed by an `ACTION` (which function to call), and to wait for an `OBSERVATION` before continuing. This is the classic ReAct prompting pattern spelled out in plain English — we are explicitly telling the model the conversational protocol it must follow, rather than relying on any special SDK feature to enforce it.</w:t>
+        <w:t xml:space="preserve"> The `ChatHistory` is seeded with a system message instructing the model to always respond with a `THOUGHT` (its reasoning) followed by an `ACTION` (which function to call), and to wait for an `OBSERVATION` before continuing. This is the classic ReAct prompting pattern spelled out </w:t>
+      </w:r>
+      <w:r>
+        <w:lastRenderedPageBreak/>
+        <w:t>in plain English — we are explicitly telling the model the conversational protocol it must follow, rather than relying on any special SDK feature to enforce it.</w:t>
       </w:r>
     </w:p>
     <w:p/>

</xml_diff>